<commit_message>
Further expand seminar: objections section, fifth fatwa, family-document annex
Adds a three-term comparison (clinical/brain/biological death), delayed
funeral rulings, two more maxims with application, a dedicated analysis
of withholding vs withdrawing support, a common-objections-and-replies
section, a fifth supporting fatwa (IslamWeb 9005), a comparative
religions synthesis, and a practical annex: a model Arabic family
information document implementing the paper's third recommendation.
Now 185 footnotes, ~264k chars (~135 est. pages).

Co-Authored-By: Claude Fable 5 <noreply@anthropic.com>
Claude-Session: https://claude.ai/code/session_01ESPDZE2KAqBUfzv5HLVvG7
</commit_message>
<xml_diff>
--- a/seminar/Abd Almahdi Dahla 212684527 - Research Evaluation Guide.docx
+++ b/seminar/Abd Almahdi Dahla 212684527 - Research Evaluation Guide.docx
@@ -1193,7 +1193,7 @@
                 <w:szCs w:val="24"/>
                 <w:rtl/>
               </w:rPr>
-              <w:t xml:space="preserve">المبحث الثالث من الفصل الرابع: قولا الفريقين بأدلتهما ووجوه استدلالهما ومناقشتها والرد عليها؛ والفصل الخامس: سبع فتاوى (4 مؤيدة + 3 معارضة) مع الرد والتعقيب؛ والقول الراجح بأربعة مبررات.</w:t>
+              <w:t xml:space="preserve">المبحث الثالث من الفصل الرابع: قولا الفريقين بأدلتهما ووجوه استدلالهما ومناقشتها والرد عليها؛ والفصل الخامس: ثماني فتاوى (5 مؤيدة + 3 معارضة) مع الرد والتعقيب؛ والقول الراجح بأربعة مبررات.</w:t>
             </w:r>
           </w:p>
         </w:tc>
@@ -1287,7 +1287,7 @@
                 <w:szCs w:val="24"/>
                 <w:rtl/>
               </w:rPr>
-              <w:t xml:space="preserve">فقرات "تعقيب" شخصية في نهاية كل فصل، وتعقيب مستقل على كل فتوى من الفتاوى السبع، ومناقشة وترجيح بصياغة الباحث.</w:t>
+              <w:t xml:space="preserve">فقرات "تعقيب" شخصية في نهاية كل فصل، وتعقيب مستقل على كل فتوى من الفتاوى الثماني، ومناقشة وترجيح بصياغة الباحث.</w:t>
             </w:r>
           </w:p>
         </w:tc>

</xml_diff>

<commit_message>
Apply lecturer's research instructions: integrity page, revised plan inside, 30 terms, 50 taqeeb, 12pt footnotes
- Restructure per mandated order: cover, integrity declaration, subject index,
  revised plan divider + plan, title divider, abstract, introduction, chapters
- Expand definitions chapter to 30 terms (8 basic + 22 related)
- Add personal commentary paragraphs (50 total) in the mandated formula,
  including closing evaluations for all eight fatwas
- Footnote size 12pt; scholars index with biographies and page numbers
- End contents index rebuilt as bordered table with computed page numbers

Co-Authored-By: Claude Fable 5 <noreply@anthropic.com>
Claude-Session: https://claude.ai/code/session_01ESPDZE2KAqBUfzv5HLVvG7
</commit_message>
<xml_diff>
--- a/seminar/Abd Almahdi Dahla 212684527 - Research Evaluation Guide.docx
+++ b/seminar/Abd Almahdi Dahla 212684527 - Research Evaluation Guide.docx
@@ -629,7 +629,7 @@
                 <w:szCs w:val="24"/>
                 <w:rtl/>
               </w:rPr>
-              <w:t xml:space="preserve">التوثيق بحواشٍ أوتوماتيكية متسلسلة (185 حاشية)، ترقيم صفحات آلي، خط موحد (Simplified Arabic)، وروجع البحث لغويًا وإملائيًا.</w:t>
+              <w:t xml:space="preserve">التوثيق بحواشٍ أوتوماتيكية متسلسلة (203 حاشية)، ترقيم صفحات آلي، خط موحد (Simplified Arabic)، وروجع البحث لغويًا وإملائيًا.</w:t>
             </w:r>
           </w:p>
         </w:tc>
@@ -1005,7 +1005,7 @@
                 <w:szCs w:val="24"/>
                 <w:rtl/>
               </w:rPr>
-              <w:t xml:space="preserve">الفصل الأول: سبعة مطالب للتعريفات الأساسية (لغةً واصطلاحًا وطبًّا) وثمانية مطالب للتعريفات ذات الصلة.</w:t>
+              <w:t xml:space="preserve">الفصل الأول: ثمانية مطالب للتعريفات الأساسيّة (لغةً واصطلاحًا وطبًّا) واثنان وعشرون مطلبًا للتعريفات ذات الصلة، فالمجموع ثلاثون مصطلحًا وفق التعليمات.</w:t>
             </w:r>
           </w:p>
         </w:tc>
@@ -1287,7 +1287,7 @@
                 <w:szCs w:val="24"/>
                 <w:rtl/>
               </w:rPr>
-              <w:t xml:space="preserve">فقرات "تعقيب" شخصية في نهاية كل فصل، وتعقيب مستقل على كل فتوى من الفتاوى الثماني، ومناقشة وترجيح بصياغة الباحث.</w:t>
+              <w:t xml:space="preserve">خمسون تعقيبًا شخصيًّا موزّعة على فصول البحث كلّها بصيغة "من خلال ما قمت بالاطلاع عليه... أرى/أعتقد أنّ"، مع تعقيب ختاميّ مقوِّم لكلّ فتوى من الفتاوى الثماني (ممتاز/جيّد/واضح مع بيان المبنى)، ومناقشة وترجيح بصياغة الباحث.</w:t>
             </w:r>
           </w:p>
         </w:tc>

</xml_diff>